<commit_message>
Vary formulaic phrasing in Bab 1 latar belakang
Rewrite two "tidak hanya X, tetapi juga Y" sentences to reduce
repetitive AI-sounding sentence structure flagged in dosen review.
</commit_message>
<xml_diff>
--- a/penulisan/BAB_1_PENDAHULUAN.docx
+++ b/penulisan/BAB_1_PENDAHULUAN.docx
@@ -87,7 +87,7 @@
         <w:jc w:val="both"/>
       </w:pPr>
       <w:r>
-        <w:t xml:space="preserve">Pada usaha makanan dan minuman, transaksi penjualan tidak hanya berkaitan dengan proses menerima pesanan dan pembayaran, tetapi juga berhubungan langsung dengan ketersediaan stok bahan baku. Setiap produk yang dijual dapat memiliki komposisi bahan tertentu, sehingga pencatatan stok tidak cukup hanya dilakukan pada jumlah produk akhir. Pengelolaan persediaan yang masih dilakukan secara manual berpotensi menimbulkan kesalahan pencatatan, keterlambatan pemrosesan pesanan, dan ketidakefisienan dalam manajemen inventaris </w:t>
+        <w:t xml:space="preserve">Pada usaha makanan dan minuman, transaksi penjualan berkaitan langsung dengan ketersediaan stok bahan baku, bukan sekadar proses menerima pesanan dan pembayaran. Setiap produk yang dijual dapat memiliki komposisi bahan tertentu, sehingga pencatatan stok tidak cukup hanya dilakukan pada jumlah produk akhir. Pengelolaan persediaan yang masih dilakukan secara manual berpotensi menimbulkan kesalahan pencatatan, keterlambatan pemrosesan pesanan, dan ketidakefisienan dalam manajemen inventaris </w:t>
       </w:r>
       <w:sdt>
         <w:sdtPr>
@@ -227,7 +227,7 @@
         </w:sdtContent>
       </w:sdt>
       <w:r>
-        <w:t xml:space="preserve">. Beberapa sistem POS sederhana belum membahas integrasi antara transaksi kasir dengan pemesanan online, belum menyediakan alur verifikasi pembayaran QRIS manual, belum menampilkan notifikasi pesanan online secara langsung pada halaman POS, dan belum mencatat riwayat perubahan status pesanan secara rinci. Perbedaan penelitian ini terletak pada pengembangan aplikasi Point of Sale berbasis web yang tidak hanya menangani transaksi kasir, tetapi juga mendukung alur pembeli online, notifikasi pesanan pending, halaman antrian online berbentuk kanban, verifikasi dan penolakan pembayaran QRIS, pencetakan struk online order, pencatatan pergerakan stok berbasis resep bahan baku, serta riwayat status pesanan.</w:t>
+        <w:t xml:space="preserve">. Beberapa sistem POS sederhana belum membahas integrasi antara transaksi kasir dengan pemesanan online, belum menyediakan alur verifikasi pembayaran QRIS manual, belum menampilkan notifikasi pesanan online secara langsung pada halaman POS, dan belum mencatat riwayat perubahan status pesanan secara rinci. Perbedaan penelitian ini terletak pada pengembangan aplikasi Point of Sale berbasis web yang mencakup transaksi kasir sekaligus alur pembeli online, notifikasi pesanan pending, halaman antrian online berbentuk kanban, verifikasi dan penolakan pembayaran QRIS, pencetakan struk online order, pencatatan pergerakan stok berbasis resep bahan baku, serta riwayat status pesanan.</w:t>
       </w:r>
     </w:p>
     <w:p>

</xml_diff>